<commit_message>
R3 title: remove 'Evaluating the' prefix; update cover/response letters; regenerate package zip
Co-Authored-By: Tatsuki Onishi <bougtoir@gmail.com>
</commit_message>
<xml_diff>
--- a/healthcare_economic_effect/output/docx/Healthcare_EHPM_ResponseToReviewers_R3.docx
+++ b/healthcare_economic_effect/output/docx/Healthcare_EHPM_ResponseToReviewers_R3.docx
@@ -46,7 +46,7 @@
           <w:b w:val="0"/>
           <w:i w:val="0"/>
         </w:rPr>
-        <w:t>"Evaluating the Demand-Side Fiscal Return to Healthcare Expenditure in Japan: Input-Output Multipliers, a Constant Health-Capital Lag, and Diagnostic Equipment Stock with Cross-Country OECD Benchmarking"</w:t>
+        <w:t>"Demand-Side Fiscal Return to Healthcare Expenditure in Japan: Input-Output Multipliers, a Constant Health-Capital Lag, and Diagnostic Equipment Stock with Cross-Country OECD Benchmarking"</w:t>
       </w:r>
     </w:p>
     <w:p/>
@@ -100,7 +100,7 @@
         <w:t xml:space="preserve">Response: </w:t>
       </w:r>
       <w:r>
-        <w:t>We agree entirely. The title has been changed to 'Evaluating the Demand-Side Fiscal Return to Healthcare Expenditure in Japan: Input-Output Multipliers, a Constant Health-Capital Lag, and Diagnostic Equipment Stock with Cross-Country OECD Benchmarking'. The abstract, aims, discussion, and conclusions no longer describe a 'dual-return' framework or a supply-side return. The tempo model is now described as testing for a constant spending-to-outcome lag, with the time-varying drift explicitly withdrawn. The manuscript is now built around (a) a material but conditional demand-side fiscal return and (b) a robust constant lag in health-capital accumulation.</w:t>
+        <w:t>We agree entirely. The title has been changed to 'Demand-Side Fiscal Return to Healthcare Expenditure in Japan: Input-Output Multipliers, a Constant Health-Capital Lag, and Diagnostic Equipment Stock with Cross-Country OECD Benchmarking'. The abstract, aims, discussion, and conclusions no longer describe a 'dual-return' framework or a supply-side return. The tempo model is now described as testing for a constant spending-to-outcome lag, with the time-varying drift explicitly withdrawn. The manuscript is now built around (a) a material but conditional demand-side fiscal return and (b) a robust constant lag in health-capital accumulation.</w:t>
       </w:r>
     </w:p>
     <w:p/>

</xml_diff>